<commit_message>
Drop incident details, split the Jira tools, and add two side projects
Remove the Slack and git-history lines from the public resume, give External VAPT to Jira and VAPT Revalidator their own bullets, and add TrashFrame and w-bonkers.
</commit_message>
<xml_diff>
--- a/Som_Chandra_Resume.docx
+++ b/Som_Chandra_Resume.docx
@@ -147,7 +147,7 @@
     </w:p>
     <w:p>
       <w:pPr>
-        <w:spacing w:before="160" w:after="40" w:line="260" w:lineRule="exact"/>
+        <w:spacing w:before="120" w:after="20" w:line="260" w:lineRule="exact"/>
         <w:suppressAutoHyphens w:val="1"/>
         <w:pBdr>
           <w:bottom w:val="single" w:sz="8" w:space="1" w:color="000000"/>
@@ -296,7 +296,7 @@
     </w:p>
     <w:p>
       <w:pPr>
-        <w:spacing w:before="160" w:after="40" w:line="260" w:lineRule="exact"/>
+        <w:spacing w:before="120" w:after="20" w:line="260" w:lineRule="exact"/>
         <w:suppressAutoHyphens w:val="1"/>
         <w:pBdr>
           <w:bottom w:val="single" w:sz="8" w:space="1" w:color="000000"/>
@@ -315,7 +315,7 @@
     </w:p>
     <w:p>
       <w:pPr>
-        <w:spacing w:before="100" w:after="0" w:line="260" w:lineRule="exact"/>
+        <w:spacing w:before="60" w:after="0" w:line="260" w:lineRule="exact"/>
         <w:tabs>
           <w:tab w:pos="10080" w:val="right"/>
         </w:tabs>
@@ -603,60 +603,6 @@
           <w:color w:val="000000"/>
           <w:sz w:val="21"/>
         </w:rPr>
-        <w:t>Drove credential-exposure response across 3,264 secret records, and a June 2026 read-only re-check found all 41 Slack webhooks and bot tokens still live after a claimed rotation</w:t>
-      </w:r>
-    </w:p>
-    <w:p>
-      <w:pPr>
-        <w:spacing w:before="0" w:after="20" w:line="260" w:lineRule="exact"/>
-        <w:suppressAutoHyphens w:val="1"/>
-        <w:ind w:left="288" w:hanging="216"/>
-      </w:pPr>
-      <w:r>
-        <w:rPr>
-          <w:rFonts w:ascii="Calibri" w:hAnsi="Calibri" w:eastAsia="Calibri" w:cs="Calibri"/>
-          <w:b w:val="0"/>
-          <w:i w:val="0"/>
-          <w:color w:val="000000"/>
-          <w:sz w:val="21"/>
-        </w:rPr>
-        <w:t xml:space="preserve">• </w:t>
-      </w:r>
-      <w:r>
-        <w:rPr>
-          <w:rFonts w:ascii="Calibri" w:hAnsi="Calibri" w:eastAsia="Calibri" w:cs="Calibri"/>
-          <w:b w:val="0"/>
-          <w:i w:val="0"/>
-          <w:color w:val="000000"/>
-          <w:sz w:val="21"/>
-        </w:rPr>
-        <w:t>Rewrote repository history so 13,784 leaked records in 201 files were dropped from the pushed branches</w:t>
-      </w:r>
-    </w:p>
-    <w:p>
-      <w:pPr>
-        <w:spacing w:before="0" w:after="20" w:line="260" w:lineRule="exact"/>
-        <w:suppressAutoHyphens w:val="1"/>
-        <w:ind w:left="288" w:hanging="216"/>
-      </w:pPr>
-      <w:r>
-        <w:rPr>
-          <w:rFonts w:ascii="Calibri" w:hAnsi="Calibri" w:eastAsia="Calibri" w:cs="Calibri"/>
-          <w:b w:val="0"/>
-          <w:i w:val="0"/>
-          <w:color w:val="000000"/>
-          <w:sz w:val="21"/>
-        </w:rPr>
-        <w:t xml:space="preserve">• </w:t>
-      </w:r>
-      <w:r>
-        <w:rPr>
-          <w:rFonts w:ascii="Calibri" w:hAnsi="Calibri" w:eastAsia="Calibri" w:cs="Calibri"/>
-          <w:b w:val="0"/>
-          <w:i w:val="0"/>
-          <w:color w:val="000000"/>
-          <w:sz w:val="21"/>
-        </w:rPr>
         <w:t>Migrated Nessus from Azure Windows to hardened AWS Linux and automated weekly Advanced scans, with reports uploaded to Google Drive</w:t>
       </w:r>
     </w:p>
@@ -684,7 +630,34 @@
           <w:color w:val="000000"/>
           <w:sz w:val="21"/>
         </w:rPr>
-        <w:t>Built ExternalVAPT2JIRA and vapt-revalidator so VAPT findings become Jira tickets and IDOR and BAC retests run through Burp, and neither tool writes to Jira without human approval</w:t>
+        <w:t>Built External VAPT to Jira, which files an external VAPT report into Jira in one click instead of a 4–5 hour manual pass, and does not post until it is approved</w:t>
+      </w:r>
+    </w:p>
+    <w:p>
+      <w:pPr>
+        <w:spacing w:before="0" w:after="20" w:line="260" w:lineRule="exact"/>
+        <w:suppressAutoHyphens w:val="1"/>
+        <w:ind w:left="288" w:hanging="216"/>
+      </w:pPr>
+      <w:r>
+        <w:rPr>
+          <w:rFonts w:ascii="Calibri" w:hAnsi="Calibri" w:eastAsia="Calibri" w:cs="Calibri"/>
+          <w:b w:val="0"/>
+          <w:i w:val="0"/>
+          <w:color w:val="000000"/>
+          <w:sz w:val="21"/>
+        </w:rPr>
+        <w:t xml:space="preserve">• </w:t>
+      </w:r>
+      <w:r>
+        <w:rPr>
+          <w:rFonts w:ascii="Calibri" w:hAnsi="Calibri" w:eastAsia="Calibri" w:cs="Calibri"/>
+          <w:b w:val="0"/>
+          <w:i w:val="0"/>
+          <w:color w:val="000000"/>
+          <w:sz w:val="21"/>
+        </w:rPr>
+        <w:t>Built VAPT Revalidator, a FastAPI worker that retests IDOR and broken access control through Burp and writes the Jira comment only after a person approves it</w:t>
       </w:r>
     </w:p>
     <w:p>
@@ -742,7 +715,7 @@
     </w:p>
     <w:p>
       <w:pPr>
-        <w:spacing w:before="100" w:after="0" w:line="260" w:lineRule="exact"/>
+        <w:spacing w:before="60" w:after="0" w:line="260" w:lineRule="exact"/>
         <w:tabs>
           <w:tab w:pos="10080" w:val="right"/>
         </w:tabs>
@@ -873,33 +846,7 @@
     </w:p>
     <w:p>
       <w:pPr>
-        <w:spacing w:before="20" w:after="20" w:line="260" w:lineRule="exact"/>
-        <w:suppressAutoHyphens w:val="1"/>
-      </w:pPr>
-      <w:r>
-        <w:rPr>
-          <w:rFonts w:ascii="Calibri" w:hAnsi="Calibri" w:eastAsia="Calibri" w:cs="Calibri"/>
-          <w:b/>
-          <w:i/>
-          <w:color w:val="505050"/>
-          <w:sz w:val="19"/>
-        </w:rPr>
-        <w:t xml:space="preserve">Technologies: </w:t>
-      </w:r>
-      <w:r>
-        <w:rPr>
-          <w:rFonts w:ascii="Calibri" w:hAnsi="Calibri" w:eastAsia="Calibri" w:cs="Calibri"/>
-          <w:b w:val="0"/>
-          <w:i/>
-          <w:color w:val="505050"/>
-          <w:sz w:val="19"/>
-        </w:rPr>
-        <w:t>Burp Suite, manual and automated API testing</w:t>
-      </w:r>
-    </w:p>
-    <w:p>
-      <w:pPr>
-        <w:spacing w:before="100" w:after="0" w:line="260" w:lineRule="exact"/>
+        <w:spacing w:before="60" w:after="0" w:line="260" w:lineRule="exact"/>
         <w:tabs>
           <w:tab w:pos="10080" w:val="right"/>
         </w:tabs>
@@ -976,7 +923,7 @@
     </w:p>
     <w:p>
       <w:pPr>
-        <w:spacing w:before="100" w:after="0" w:line="260" w:lineRule="exact"/>
+        <w:spacing w:before="60" w:after="0" w:line="260" w:lineRule="exact"/>
         <w:tabs>
           <w:tab w:pos="10080" w:val="right"/>
         </w:tabs>
@@ -1053,7 +1000,7 @@
     </w:p>
     <w:p>
       <w:pPr>
-        <w:spacing w:before="160" w:after="40" w:line="260" w:lineRule="exact"/>
+        <w:spacing w:before="120" w:after="20" w:line="260" w:lineRule="exact"/>
         <w:suppressAutoHyphens w:val="1"/>
         <w:pBdr>
           <w:bottom w:val="single" w:sz="8" w:space="1" w:color="000000"/>
@@ -1072,7 +1019,7 @@
     </w:p>
     <w:p>
       <w:pPr>
-        <w:spacing w:before="100" w:after="0" w:line="260" w:lineRule="exact"/>
+        <w:spacing w:before="60" w:after="0" w:line="260" w:lineRule="exact"/>
         <w:tabs>
           <w:tab w:pos="10080" w:val="right"/>
         </w:tabs>
@@ -1201,33 +1148,7 @@
     </w:p>
     <w:p>
       <w:pPr>
-        <w:spacing w:before="20" w:after="20" w:line="260" w:lineRule="exact"/>
-        <w:suppressAutoHyphens w:val="1"/>
-      </w:pPr>
-      <w:r>
-        <w:rPr>
-          <w:rFonts w:ascii="Calibri" w:hAnsi="Calibri" w:eastAsia="Calibri" w:cs="Calibri"/>
-          <w:b/>
-          <w:i/>
-          <w:color w:val="505050"/>
-          <w:sz w:val="19"/>
-        </w:rPr>
-        <w:t xml:space="preserve">Technologies: </w:t>
-      </w:r>
-      <w:r>
-        <w:rPr>
-          <w:rFonts w:ascii="Calibri" w:hAnsi="Calibri" w:eastAsia="Calibri" w:cs="Calibri"/>
-          <w:b w:val="0"/>
-          <w:i/>
-          <w:color w:val="505050"/>
-          <w:sz w:val="19"/>
-        </w:rPr>
-        <w:t>Python, adb, drozer, apktool, Frida</w:t>
-      </w:r>
-    </w:p>
-    <w:p>
-      <w:pPr>
-        <w:spacing w:before="100" w:after="0" w:line="260" w:lineRule="exact"/>
+        <w:spacing w:before="60" w:after="0" w:line="260" w:lineRule="exact"/>
         <w:tabs>
           <w:tab w:pos="10080" w:val="right"/>
         </w:tabs>
@@ -1329,33 +1250,7 @@
     </w:p>
     <w:p>
       <w:pPr>
-        <w:spacing w:before="20" w:after="20" w:line="260" w:lineRule="exact"/>
-        <w:suppressAutoHyphens w:val="1"/>
-      </w:pPr>
-      <w:r>
-        <w:rPr>
-          <w:rFonts w:ascii="Calibri" w:hAnsi="Calibri" w:eastAsia="Calibri" w:cs="Calibri"/>
-          <w:b/>
-          <w:i/>
-          <w:color w:val="505050"/>
-          <w:sz w:val="19"/>
-        </w:rPr>
-        <w:t xml:space="preserve">Technologies: </w:t>
-      </w:r>
-      <w:r>
-        <w:rPr>
-          <w:rFonts w:ascii="Calibri" w:hAnsi="Calibri" w:eastAsia="Calibri" w:cs="Calibri"/>
-          <w:b w:val="0"/>
-          <w:i/>
-          <w:color w:val="505050"/>
-          <w:sz w:val="19"/>
-        </w:rPr>
-        <w:t>Python, libimobiledevice, Frida, objection</w:t>
-      </w:r>
-    </w:p>
-    <w:p>
-      <w:pPr>
-        <w:spacing w:before="100" w:after="0" w:line="260" w:lineRule="exact"/>
+        <w:spacing w:before="60" w:after="0" w:line="260" w:lineRule="exact"/>
         <w:tabs>
           <w:tab w:pos="10080" w:val="right"/>
         </w:tabs>
@@ -1430,33 +1325,7 @@
     </w:p>
     <w:p>
       <w:pPr>
-        <w:spacing w:before="20" w:after="20" w:line="260" w:lineRule="exact"/>
-        <w:suppressAutoHyphens w:val="1"/>
-      </w:pPr>
-      <w:r>
-        <w:rPr>
-          <w:rFonts w:ascii="Calibri" w:hAnsi="Calibri" w:eastAsia="Calibri" w:cs="Calibri"/>
-          <w:b/>
-          <w:i/>
-          <w:color w:val="505050"/>
-          <w:sz w:val="19"/>
-        </w:rPr>
-        <w:t xml:space="preserve">Technologies: </w:t>
-      </w:r>
-      <w:r>
-        <w:rPr>
-          <w:rFonts w:ascii="Calibri" w:hAnsi="Calibri" w:eastAsia="Calibri" w:cs="Calibri"/>
-          <w:b w:val="0"/>
-          <w:i/>
-          <w:color w:val="505050"/>
-          <w:sz w:val="19"/>
-        </w:rPr>
-        <w:t>Kotlin</w:t>
-      </w:r>
-    </w:p>
-    <w:p>
-      <w:pPr>
-        <w:spacing w:before="100" w:after="0" w:line="260" w:lineRule="exact"/>
+        <w:spacing w:before="60" w:after="0" w:line="260" w:lineRule="exact"/>
         <w:tabs>
           <w:tab w:pos="10080" w:val="right"/>
         </w:tabs>
@@ -1531,33 +1400,179 @@
     </w:p>
     <w:p>
       <w:pPr>
-        <w:spacing w:before="20" w:after="20" w:line="260" w:lineRule="exact"/>
+        <w:spacing w:before="60" w:after="0" w:line="260" w:lineRule="exact"/>
+        <w:tabs>
+          <w:tab w:pos="10080" w:val="right"/>
+        </w:tabs>
         <w:suppressAutoHyphens w:val="1"/>
       </w:pPr>
       <w:r>
         <w:rPr>
           <w:rFonts w:ascii="Calibri" w:hAnsi="Calibri" w:eastAsia="Calibri" w:cs="Calibri"/>
           <w:b/>
-          <w:i/>
-          <w:color w:val="505050"/>
-          <w:sz w:val="19"/>
+          <w:i w:val="0"/>
+          <w:color w:val="000000"/>
+          <w:sz w:val="21"/>
         </w:rPr>
-        <w:t xml:space="preserve">Technologies: </w:t>
+        <w:t>TrashFrame</w:t>
       </w:r>
       <w:r>
         <w:rPr>
           <w:rFonts w:ascii="Calibri" w:hAnsi="Calibri" w:eastAsia="Calibri" w:cs="Calibri"/>
           <w:b w:val="0"/>
-          <w:i/>
-          <w:color w:val="505050"/>
-          <w:sz w:val="19"/>
+          <w:i w:val="0"/>
+          <w:color w:val="000000"/>
+          <w:sz w:val="21"/>
         </w:rPr>
-        <w:t>Python, Docker, nuclei</w:t>
+        <w:tab/>
+        <w:t>June 2026</w:t>
       </w:r>
     </w:p>
     <w:p>
       <w:pPr>
-        <w:spacing w:before="160" w:after="40" w:line="260" w:lineRule="exact"/>
+        <w:spacing w:before="0" w:after="20" w:line="260" w:lineRule="exact"/>
+        <w:suppressAutoHyphens w:val="1"/>
+      </w:pPr>
+      <w:hyperlink r:id="rId19">
+        <w:r>
+          <w:rPr>
+            <w:rFonts w:ascii="Calibri" w:hAnsi="Calibri" w:eastAsia="Calibri" w:cs="Calibri"/>
+            <w:sz w:val="19"/>
+            <w:szCs w:val="19"/>
+            <w:color w:val="505050"/>
+            <w:u w:val="none"/>
+          </w:rPr>
+          <w:t xml:space="preserve">github.com/Somchandra17/TrashFrame</w:t>
+        </w:r>
+      </w:hyperlink>
+      <w:r>
+        <w:rPr>
+          <w:rFonts w:ascii="Calibri" w:hAnsi="Calibri" w:eastAsia="Calibri" w:cs="Calibri"/>
+          <w:b w:val="0"/>
+          <w:i w:val="0"/>
+          <w:color w:val="505050"/>
+          <w:sz w:val="19"/>
+        </w:rPr>
+        <w:t xml:space="preserve">  </w:t>
+      </w:r>
+      <w:hyperlink r:id="rId20">
+        <w:r>
+          <w:rPr>
+            <w:rFonts w:ascii="Calibri" w:hAnsi="Calibri" w:eastAsia="Calibri" w:cs="Calibri"/>
+            <w:sz w:val="19"/>
+            <w:szCs w:val="19"/>
+            <w:color w:val="505050"/>
+            <w:u w:val="none"/>
+          </w:rPr>
+          <w:t xml:space="preserve">trash-frame.vercel.app</w:t>
+        </w:r>
+      </w:hyperlink>
+    </w:p>
+    <w:p>
+      <w:pPr>
+        <w:spacing w:before="0" w:after="20" w:line="260" w:lineRule="exact"/>
+        <w:suppressAutoHyphens w:val="1"/>
+        <w:ind w:left="288" w:hanging="216"/>
+      </w:pPr>
+      <w:r>
+        <w:rPr>
+          <w:rFonts w:ascii="Calibri" w:hAnsi="Calibri" w:eastAsia="Calibri" w:cs="Calibri"/>
+          <w:b w:val="0"/>
+          <w:i w:val="0"/>
+          <w:color w:val="000000"/>
+          <w:sz w:val="21"/>
+        </w:rPr>
+        <w:t xml:space="preserve">• </w:t>
+      </w:r>
+      <w:r>
+        <w:rPr>
+          <w:rFonts w:ascii="Calibri" w:hAnsi="Calibri" w:eastAsia="Calibri" w:cs="Calibri"/>
+          <w:b w:val="0"/>
+          <w:i w:val="0"/>
+          <w:color w:val="000000"/>
+          <w:sz w:val="21"/>
+        </w:rPr>
+        <w:t>Built a Next.js app that turns a Spotify album or song link into a printable poster, with 14 themes and DPI export for real frames</w:t>
+      </w:r>
+    </w:p>
+    <w:p>
+      <w:pPr>
+        <w:spacing w:before="60" w:after="0" w:line="260" w:lineRule="exact"/>
+        <w:tabs>
+          <w:tab w:pos="10080" w:val="right"/>
+        </w:tabs>
+        <w:suppressAutoHyphens w:val="1"/>
+      </w:pPr>
+      <w:r>
+        <w:rPr>
+          <w:rFonts w:ascii="Calibri" w:hAnsi="Calibri" w:eastAsia="Calibri" w:cs="Calibri"/>
+          <w:b/>
+          <w:i w:val="0"/>
+          <w:color w:val="000000"/>
+          <w:sz w:val="21"/>
+        </w:rPr>
+        <w:t>w-bonkers</w:t>
+      </w:r>
+      <w:r>
+        <w:rPr>
+          <w:rFonts w:ascii="Calibri" w:hAnsi="Calibri" w:eastAsia="Calibri" w:cs="Calibri"/>
+          <w:b w:val="0"/>
+          <w:i w:val="0"/>
+          <w:color w:val="000000"/>
+          <w:sz w:val="21"/>
+        </w:rPr>
+        <w:tab/>
+        <w:t>July 2026</w:t>
+      </w:r>
+    </w:p>
+    <w:p>
+      <w:pPr>
+        <w:spacing w:before="0" w:after="20" w:line="260" w:lineRule="exact"/>
+        <w:suppressAutoHyphens w:val="1"/>
+      </w:pPr>
+      <w:hyperlink r:id="rId21">
+        <w:r>
+          <w:rPr>
+            <w:rFonts w:ascii="Calibri" w:hAnsi="Calibri" w:eastAsia="Calibri" w:cs="Calibri"/>
+            <w:sz w:val="19"/>
+            <w:szCs w:val="19"/>
+            <w:color w:val="505050"/>
+            <w:u w:val="none"/>
+          </w:rPr>
+          <w:t xml:space="preserve">github.com/Somchandra17/w-bonkers</w:t>
+        </w:r>
+      </w:hyperlink>
+    </w:p>
+    <w:p>
+      <w:pPr>
+        <w:spacing w:before="0" w:after="20" w:line="260" w:lineRule="exact"/>
+        <w:suppressAutoHyphens w:val="1"/>
+        <w:ind w:left="288" w:hanging="216"/>
+      </w:pPr>
+      <w:r>
+        <w:rPr>
+          <w:rFonts w:ascii="Calibri" w:hAnsi="Calibri" w:eastAsia="Calibri" w:cs="Calibri"/>
+          <w:b w:val="0"/>
+          <w:i w:val="0"/>
+          <w:color w:val="000000"/>
+          <w:sz w:val="21"/>
+        </w:rPr>
+        <w:t xml:space="preserve">• </w:t>
+      </w:r>
+      <w:r>
+        <w:rPr>
+          <w:rFonts w:ascii="Calibri" w:hAnsi="Calibri" w:eastAsia="Calibri" w:cs="Calibri"/>
+          <w:b w:val="0"/>
+          <w:i w:val="0"/>
+          <w:color w:val="000000"/>
+          <w:sz w:val="21"/>
+        </w:rPr>
+        <w:t>Built an NSE portfolio copilot for Claude Code and Codex, with a deterministic plan file, Todoist order tasks, and local archives, and no auto-trading</w:t>
+      </w:r>
+    </w:p>
+    <w:p>
+      <w:pPr>
+        <w:spacing w:before="120" w:after="20" w:line="260" w:lineRule="exact"/>
         <w:suppressAutoHyphens w:val="1"/>
         <w:pBdr>
           <w:bottom w:val="single" w:sz="8" w:space="1" w:color="000000"/>
@@ -1636,7 +1651,7 @@
     </w:p>
     <w:p>
       <w:pPr>
-        <w:spacing w:before="160" w:after="40" w:line="260" w:lineRule="exact"/>
+        <w:spacing w:before="120" w:after="20" w:line="260" w:lineRule="exact"/>
         <w:suppressAutoHyphens w:val="1"/>
         <w:pBdr>
           <w:bottom w:val="single" w:sz="8" w:space="1" w:color="000000"/>
@@ -1763,7 +1778,7 @@
     </w:p>
     <w:p>
       <w:pPr>
-        <w:spacing w:before="160" w:after="40" w:line="260" w:lineRule="exact"/>
+        <w:spacing w:before="120" w:after="20" w:line="260" w:lineRule="exact"/>
         <w:suppressAutoHyphens w:val="1"/>
         <w:pBdr>
           <w:bottom w:val="single" w:sz="8" w:space="1" w:color="000000"/>
@@ -1782,7 +1797,7 @@
     </w:p>
     <w:p>
       <w:pPr>
-        <w:spacing w:before="100" w:after="0" w:line="260" w:lineRule="exact"/>
+        <w:spacing w:before="60" w:after="0" w:line="260" w:lineRule="exact"/>
         <w:tabs>
           <w:tab w:pos="10080" w:val="right"/>
         </w:tabs>

</xml_diff>

<commit_message>
Fix glued ATS text and add a Tools skills line
Right-aligned dates and locations had no space glyph before them, so
same-line parsers read "Cyber Security EngineerBengaluru". Emit a real
space before h(1fr) in cvhead, and before each date tab in the docx.

Add a Tools line and "penetration testing" to Technical Skills, spell
out SQL injection, keep docx entry headings with their next line, and
set the docx author metadata.
</commit_message>
<xml_diff>
--- a/Som_Chandra_Resume.docx
+++ b/Som_Chandra_Resume.docx
@@ -187,7 +187,7 @@
           <w:color w:val="000000"/>
           <w:sz w:val="21"/>
         </w:rPr>
-        <w:t>Gray-box web and API VAPT, OWASP Top 10, GraphQL security, CVSS scoring and SLA mapping</w:t>
+        <w:t>Gray-box web and API penetration testing (VAPT), OWASP Top 10, GraphQL security, CVSS scoring and SLA mapping</w:t>
       </w:r>
     </w:p>
     <w:p>
@@ -296,6 +296,32 @@
     </w:p>
     <w:p>
       <w:pPr>
+        <w:spacing w:before="0" w:after="40" w:line="260" w:lineRule="exact"/>
+        <w:suppressAutoHyphens w:val="1"/>
+      </w:pPr>
+      <w:r>
+        <w:rPr>
+          <w:rFonts w:ascii="Calibri" w:hAnsi="Calibri" w:eastAsia="Calibri" w:cs="Calibri"/>
+          <w:b/>
+          <w:i w:val="0"/>
+          <w:color w:val="000000"/>
+          <w:sz w:val="21"/>
+        </w:rPr>
+        <w:t xml:space="preserve">Tools: </w:t>
+      </w:r>
+      <w:r>
+        <w:rPr>
+          <w:rFonts w:ascii="Calibri" w:hAnsi="Calibri" w:eastAsia="Calibri" w:cs="Calibri"/>
+          <w:b w:val="0"/>
+          <w:i w:val="0"/>
+          <w:color w:val="000000"/>
+          <w:sz w:val="21"/>
+        </w:rPr>
+        <w:t>Burp Suite, Frida, objection, adb, drozer, apktool, Nessus, nuclei, libimobiledevice, Docker, Jira, AWS</w:t>
+      </w:r>
+    </w:p>
+    <w:p>
+      <w:pPr>
         <w:spacing w:before="120" w:after="20" w:line="260" w:lineRule="exact"/>
         <w:suppressAutoHyphens w:val="1"/>
         <w:pBdr>
@@ -315,6 +341,7 @@
     </w:p>
     <w:p>
       <w:pPr>
+        <w:keepNext/>
         <w:spacing w:before="60" w:after="0" w:line="260" w:lineRule="exact"/>
         <w:tabs>
           <w:tab w:pos="10080" w:val="right"/>
@@ -359,6 +386,7 @@
           <w:color w:val="000000"/>
           <w:sz w:val="21"/>
         </w:rPr>
+        <w:t xml:space="preserve"> </w:t>
         <w:tab/>
         <w:t>June 2025 – Present</w:t>
       </w:r>
@@ -715,6 +743,7 @@
     </w:p>
     <w:p>
       <w:pPr>
+        <w:keepNext/>
         <w:spacing w:before="60" w:after="0" w:line="260" w:lineRule="exact"/>
         <w:tabs>
           <w:tab w:pos="10080" w:val="right"/>
@@ -759,6 +788,7 @@
           <w:color w:val="000000"/>
           <w:sz w:val="21"/>
         </w:rPr>
+        <w:t xml:space="preserve"> </w:t>
         <w:tab/>
         <w:t>Jan 2025 – May 2025</w:t>
       </w:r>
@@ -846,6 +876,7 @@
     </w:p>
     <w:p>
       <w:pPr>
+        <w:keepNext/>
         <w:spacing w:before="60" w:after="0" w:line="260" w:lineRule="exact"/>
         <w:tabs>
           <w:tab w:pos="10080" w:val="right"/>
@@ -890,6 +921,7 @@
           <w:color w:val="000000"/>
           <w:sz w:val="21"/>
         </w:rPr>
+        <w:t xml:space="preserve"> </w:t>
         <w:tab/>
         <w:t>Feb 2022 – July 2022</w:t>
       </w:r>
@@ -923,6 +955,7 @@
     </w:p>
     <w:p>
       <w:pPr>
+        <w:keepNext/>
         <w:spacing w:before="60" w:after="0" w:line="260" w:lineRule="exact"/>
         <w:tabs>
           <w:tab w:pos="10080" w:val="right"/>
@@ -967,6 +1000,7 @@
           <w:color w:val="000000"/>
           <w:sz w:val="21"/>
         </w:rPr>
+        <w:t xml:space="preserve"> </w:t>
         <w:tab/>
         <w:t>Oct 2021 – Dec 2021</w:t>
       </w:r>
@@ -1019,6 +1053,7 @@
     </w:p>
     <w:p>
       <w:pPr>
+        <w:keepNext/>
         <w:spacing w:before="60" w:after="0" w:line="260" w:lineRule="exact"/>
         <w:tabs>
           <w:tab w:pos="10080" w:val="right"/>
@@ -1043,12 +1078,14 @@
           <w:color w:val="000000"/>
           <w:sz w:val="21"/>
         </w:rPr>
+        <w:t xml:space="preserve"> </w:t>
         <w:tab/>
         <w:t>Mar 2026 – July 2026</w:t>
       </w:r>
     </w:p>
     <w:p>
       <w:pPr>
+        <w:keepNext/>
         <w:spacing w:before="0" w:after="20" w:line="260" w:lineRule="exact"/>
         <w:suppressAutoHyphens w:val="1"/>
       </w:pPr>
@@ -1148,6 +1185,7 @@
     </w:p>
     <w:p>
       <w:pPr>
+        <w:keepNext/>
         <w:spacing w:before="60" w:after="0" w:line="260" w:lineRule="exact"/>
         <w:tabs>
           <w:tab w:pos="10080" w:val="right"/>
@@ -1172,12 +1210,14 @@
           <w:color w:val="000000"/>
           <w:sz w:val="21"/>
         </w:rPr>
+        <w:t xml:space="preserve"> </w:t>
         <w:tab/>
         <w:t>June 2026</w:t>
       </w:r>
     </w:p>
     <w:p>
       <w:pPr>
+        <w:keepNext/>
         <w:spacing w:before="0" w:after="20" w:line="260" w:lineRule="exact"/>
         <w:suppressAutoHyphens w:val="1"/>
       </w:pPr>
@@ -1250,6 +1290,7 @@
     </w:p>
     <w:p>
       <w:pPr>
+        <w:keepNext/>
         <w:spacing w:before="60" w:after="0" w:line="260" w:lineRule="exact"/>
         <w:tabs>
           <w:tab w:pos="10080" w:val="right"/>
@@ -1274,12 +1315,14 @@
           <w:color w:val="000000"/>
           <w:sz w:val="21"/>
         </w:rPr>
+        <w:t xml:space="preserve"> </w:t>
         <w:tab/>
         <w:t>Apr 2026</w:t>
       </w:r>
     </w:p>
     <w:p>
       <w:pPr>
+        <w:keepNext/>
         <w:spacing w:before="0" w:after="20" w:line="260" w:lineRule="exact"/>
         <w:suppressAutoHyphens w:val="1"/>
       </w:pPr>
@@ -1325,6 +1368,7 @@
     </w:p>
     <w:p>
       <w:pPr>
+        <w:keepNext/>
         <w:spacing w:before="60" w:after="0" w:line="260" w:lineRule="exact"/>
         <w:tabs>
           <w:tab w:pos="10080" w:val="right"/>
@@ -1349,12 +1393,14 @@
           <w:color w:val="000000"/>
           <w:sz w:val="21"/>
         </w:rPr>
+        <w:t xml:space="preserve"> </w:t>
         <w:tab/>
         <w:t>Mar 2026 – June 2026</w:t>
       </w:r>
     </w:p>
     <w:p>
       <w:pPr>
+        <w:keepNext/>
         <w:spacing w:before="0" w:after="20" w:line="260" w:lineRule="exact"/>
         <w:suppressAutoHyphens w:val="1"/>
       </w:pPr>
@@ -1400,6 +1446,7 @@
     </w:p>
     <w:p>
       <w:pPr>
+        <w:keepNext/>
         <w:spacing w:before="60" w:after="0" w:line="260" w:lineRule="exact"/>
         <w:tabs>
           <w:tab w:pos="10080" w:val="right"/>
@@ -1424,12 +1471,14 @@
           <w:color w:val="000000"/>
           <w:sz w:val="21"/>
         </w:rPr>
+        <w:t xml:space="preserve"> </w:t>
         <w:tab/>
         <w:t>June 2026</w:t>
       </w:r>
     </w:p>
     <w:p>
       <w:pPr>
+        <w:keepNext/>
         <w:spacing w:before="0" w:after="20" w:line="260" w:lineRule="exact"/>
         <w:suppressAutoHyphens w:val="1"/>
       </w:pPr>
@@ -1497,6 +1546,7 @@
     </w:p>
     <w:p>
       <w:pPr>
+        <w:keepNext/>
         <w:spacing w:before="60" w:after="0" w:line="260" w:lineRule="exact"/>
         <w:tabs>
           <w:tab w:pos="10080" w:val="right"/>
@@ -1521,12 +1571,14 @@
           <w:color w:val="000000"/>
           <w:sz w:val="21"/>
         </w:rPr>
+        <w:t xml:space="preserve"> </w:t>
         <w:tab/>
         <w:t>July 2026</w:t>
       </w:r>
     </w:p>
     <w:p>
       <w:pPr>
+        <w:keepNext/>
         <w:spacing w:before="0" w:after="20" w:line="260" w:lineRule="exact"/>
         <w:suppressAutoHyphens w:val="1"/>
       </w:pPr>
@@ -1591,6 +1643,7 @@
     </w:p>
     <w:p>
       <w:pPr>
+        <w:keepNext/>
         <w:spacing w:before="0" w:after="40" w:line="260" w:lineRule="exact"/>
         <w:tabs>
           <w:tab w:pos="10080" w:val="right"/>
@@ -1615,12 +1668,14 @@
           <w:color w:val="000000"/>
           <w:sz w:val="21"/>
         </w:rPr>
+        <w:t xml:space="preserve"> </w:t>
         <w:tab/>
         <w:t>Jan 2023</w:t>
       </w:r>
     </w:p>
     <w:p>
       <w:pPr>
+        <w:keepNext/>
         <w:spacing w:before="0" w:after="40" w:line="260" w:lineRule="exact"/>
         <w:tabs>
           <w:tab w:pos="10080" w:val="right"/>
@@ -1645,6 +1700,7 @@
           <w:color w:val="000000"/>
           <w:sz w:val="21"/>
         </w:rPr>
+        <w:t xml:space="preserve"> </w:t>
         <w:tab/>
         <w:t>Dec 2024</w:t>
       </w:r>
@@ -1797,6 +1853,7 @@
     </w:p>
     <w:p>
       <w:pPr>
+        <w:keepNext/>
         <w:spacing w:before="60" w:after="0" w:line="260" w:lineRule="exact"/>
         <w:tabs>
           <w:tab w:pos="10080" w:val="right"/>
@@ -1841,6 +1898,7 @@
           <w:color w:val="000000"/>
           <w:sz w:val="21"/>
         </w:rPr>
+        <w:t xml:space="preserve"> </w:t>
         <w:tab/>
         <w:t>May 2025</w:t>
       </w:r>

</xml_diff>

<commit_message>
Add incident RCA work and correct the internship dates
Add two bullets for the CI/CD intrusion root-cause analysis and the
credential-exposure response, worded without system names, CVE, dates,
or secret counts because this repo is public. Extend the Incident
Response skill line to match.

Set the internship to Mar 2024 - Jun 2025 per the completion
certificate, and drop the in-bullet May 2025 dates that no longer fit.

To stay at 2 pages: fold the SSL-pinning line into the external VAPT
bullet, trim the Nessus detail, tighten the page-one bullet gap, and
move the Word copy to A4.
</commit_message>
<xml_diff>
--- a/Som_Chandra_Resume.docx
+++ b/Som_Chandra_Resume.docx
@@ -291,7 +291,7 @@
           <w:color w:val="000000"/>
           <w:sz w:val="21"/>
         </w:rPr>
-        <w:t>Credential-exposure response, secrets inventory, read-only rotation checks</w:t>
+        <w:t>Root-cause analysis, attack reconstruction, credential-exposure response, read-only rotation checks</w:t>
       </w:r>
     </w:p>
     <w:p>
@@ -469,6 +469,60 @@
           <w:color w:val="000000"/>
           <w:sz w:val="21"/>
         </w:rPr>
+        <w:t>Led root-cause analysis and attack reconstruction for a CI/CD server intrusion, tracing 3 separate attacker visits from on-host artifacts, and wrote the hardening worklist for the rebuilt host</w:t>
+      </w:r>
+    </w:p>
+    <w:p>
+      <w:pPr>
+        <w:spacing w:before="0" w:after="20" w:line="260" w:lineRule="exact"/>
+        <w:suppressAutoHyphens w:val="1"/>
+        <w:ind w:left="288" w:hanging="216"/>
+      </w:pPr>
+      <w:r>
+        <w:rPr>
+          <w:rFonts w:ascii="Calibri" w:hAnsi="Calibri" w:eastAsia="Calibri" w:cs="Calibri"/>
+          <w:b w:val="0"/>
+          <w:i w:val="0"/>
+          <w:color w:val="000000"/>
+          <w:sz w:val="21"/>
+        </w:rPr>
+        <w:t xml:space="preserve">• </w:t>
+      </w:r>
+      <w:r>
+        <w:rPr>
+          <w:rFonts w:ascii="Calibri" w:hAnsi="Calibri" w:eastAsia="Calibri" w:cs="Calibri"/>
+          <w:b w:val="0"/>
+          <w:i w:val="0"/>
+          <w:color w:val="000000"/>
+          <w:sz w:val="21"/>
+        </w:rPr>
+        <w:t>Drove credential-exposure response, triaging the leaked secrets into a per-service rotation tracker, checking keys read-only from the owner side, and catching keys reported as rotated that were still live</w:t>
+      </w:r>
+    </w:p>
+    <w:p>
+      <w:pPr>
+        <w:spacing w:before="0" w:after="20" w:line="260" w:lineRule="exact"/>
+        <w:suppressAutoHyphens w:val="1"/>
+        <w:ind w:left="288" w:hanging="216"/>
+      </w:pPr>
+      <w:r>
+        <w:rPr>
+          <w:rFonts w:ascii="Calibri" w:hAnsi="Calibri" w:eastAsia="Calibri" w:cs="Calibri"/>
+          <w:b w:val="0"/>
+          <w:i w:val="0"/>
+          <w:color w:val="000000"/>
+          <w:sz w:val="21"/>
+        </w:rPr>
+        <w:t xml:space="preserve">• </w:t>
+      </w:r>
+      <w:r>
+        <w:rPr>
+          <w:rFonts w:ascii="Calibri" w:hAnsi="Calibri" w:eastAsia="Calibri" w:cs="Calibri"/>
+          <w:b w:val="0"/>
+          <w:i w:val="0"/>
+          <w:color w:val="000000"/>
+          <w:sz w:val="21"/>
+        </w:rPr>
         <w:t>Built a 9-phase Android DAST framework with adb, drozer, and apktool that cut per-app assessment from 1–2 days to under 1 hour, and that work contributed to the team declining a paid PortSwigger Burp DAST purchase</w:t>
       </w:r>
     </w:p>
@@ -523,7 +577,7 @@
           <w:color w:val="000000"/>
           <w:sz w:val="21"/>
         </w:rPr>
-        <w:t>Owned external VAPT across 4 vendors and 4 major cycles on web, Android, iOS, and a driver app, including false-positive filtering, compensating controls the vendor accepted, and revalidation</w:t>
+        <w:t>Owned external VAPT across 4 vendors and 4 major cycles on web, Android, iOS, and a driver app, including false-positive filtering (such as an SSL-pinning bypass that needed a rooted device and did not reproduce on production), compensating controls the vendor accepted, and revalidation</w:t>
       </w:r>
     </w:p>
     <w:p>
@@ -577,33 +631,6 @@
           <w:color w:val="000000"/>
           <w:sz w:val="21"/>
         </w:rPr>
-        <w:t>Validated that an Android SSL-pinning bypass required a rooted, instrumented device and did not reproduce on the production build</w:t>
-      </w:r>
-    </w:p>
-    <w:p>
-      <w:pPr>
-        <w:spacing w:before="0" w:after="20" w:line="260" w:lineRule="exact"/>
-        <w:suppressAutoHyphens w:val="1"/>
-        <w:ind w:left="288" w:hanging="216"/>
-      </w:pPr>
-      <w:r>
-        <w:rPr>
-          <w:rFonts w:ascii="Calibri" w:hAnsi="Calibri" w:eastAsia="Calibri" w:cs="Calibri"/>
-          <w:b w:val="0"/>
-          <w:i w:val="0"/>
-          <w:color w:val="000000"/>
-          <w:sz w:val="21"/>
-        </w:rPr>
-        <w:t xml:space="preserve">• </w:t>
-      </w:r>
-      <w:r>
-        <w:rPr>
-          <w:rFonts w:ascii="Calibri" w:hAnsi="Calibri" w:eastAsia="Calibri" w:cs="Calibri"/>
-          <w:b w:val="0"/>
-          <w:i w:val="0"/>
-          <w:color w:val="000000"/>
-          <w:sz w:val="21"/>
-        </w:rPr>
         <w:t>Ran the first in-house AI and LLM assessment of an internal chatbot, where prompt injection bypassed tool-persona and policy controls, and turned that work into a reusable method</w:t>
       </w:r>
     </w:p>
@@ -631,7 +658,7 @@
           <w:color w:val="000000"/>
           <w:sz w:val="21"/>
         </w:rPr>
-        <w:t>Migrated Nessus from Azure Windows to hardened AWS Linux and automated weekly Advanced scans, with reports uploaded to Google Drive</w:t>
+        <w:t>Migrated Nessus from Azure Windows to hardened AWS Linux and automated weekly Advanced scans</w:t>
       </w:r>
     </w:p>
     <w:p>
@@ -790,7 +817,7 @@
         </w:rPr>
         <w:t xml:space="preserve"> </w:t>
         <w:tab/>
-        <w:t>Jan 2025 – May 2025</w:t>
+        <w:t>Mar 2024 – June 2025</w:t>
       </w:r>
     </w:p>
     <w:p>
@@ -817,7 +844,7 @@
           <w:color w:val="000000"/>
           <w:sz w:val="21"/>
         </w:rPr>
-        <w:t>Raised critical reflected XSS findings on the transport-management API in an Apr–May 2025 manual and automated VAPT, and published the report</w:t>
+        <w:t>Raised critical reflected XSS findings on the transport-management API in manual and automated VAPT, and published the report</w:t>
       </w:r>
     </w:p>
     <w:p>
@@ -844,7 +871,7 @@
           <w:color w:val="000000"/>
           <w:sz w:val="21"/>
         </w:rPr>
-        <w:t>Escalated critical issues to engineering leads the same day during a May 2025 production-clone assessment</w:t>
+        <w:t>Escalated critical issues to engineering leads the same day during a production-clone assessment</w:t>
       </w:r>
     </w:p>
     <w:p>
@@ -871,7 +898,7 @@
           <w:color w:val="000000"/>
           <w:sz w:val="21"/>
         </w:rPr>
-        <w:t>Surfaced a gap on an employee-data API call during a May 2025 authentication retrofit, and engineering wrapped the call in authentication</w:t>
+        <w:t>Surfaced a gap on an employee-data API call during an authentication retrofit, and engineering wrapped the call in authentication</w:t>
       </w:r>
     </w:p>
     <w:p>
@@ -1931,7 +1958,7 @@
       </w:r>
     </w:p>
     <w:sectPr>
-      <w:pgSz w:w="12240" w:h="15840"/>
+      <w:pgSz w:w="11906" w:h="16838"/>
       <w:pgMar w:top="1080" w:right="1080" w:bottom="1080" w:left="1080" w:header="0" w:footer="0" w:gutter="0"/>
       <w:cols w:space="720"/>
       <w:docGrid w:linePitch="360"/>

</xml_diff>

<commit_message>
Match the Word copy's incident bullets to the Typst wording
</commit_message>
<xml_diff>
--- a/Som_Chandra_Resume.docx
+++ b/Som_Chandra_Resume.docx
@@ -469,7 +469,7 @@
           <w:color w:val="000000"/>
           <w:sz w:val="21"/>
         </w:rPr>
-        <w:t>Led root-cause analysis and attack reconstruction for a CI/CD server intrusion, tracing 3 separate attacker visits from on-host artifacts, and wrote the hardening worklist for the rebuilt host</w:t>
+        <w:t>Led root-cause analysis and attack reconstruction for a CI/CD server intrusion, tracing 3 separate attacker visits from on-host artifacts (file read, credential decryption, RCE, root), and wrote the hardening worklist for the rebuilt host</w:t>
       </w:r>
     </w:p>
     <w:p>
@@ -496,7 +496,7 @@
           <w:color w:val="000000"/>
           <w:sz w:val="21"/>
         </w:rPr>
-        <w:t>Drove credential-exposure response, triaging the leaked secrets into a per-service rotation tracker, checking keys read-only from the owner side, and catching keys reported as rotated that were still live</w:t>
+        <w:t>Drove credential-exposure response: triaged the leaked secrets into a per-service rotation tracker, checked keys read-only from the owner side, and caught keys reported as rotated that were still live</w:t>
       </w:r>
     </w:p>
     <w:p>

</xml_diff>